<commit_message>
Make assignment voice more natural and personal
Co-authored-by: TheXKnight117 <TheXKnight117@users.noreply.github.com>
</commit_message>
<xml_diff>
--- a/Semana1_Apellidos_del_grupo.docx
+++ b/Semana1_Apellidos_del_grupo.docx
@@ -136,7 +136,7 @@
         <w:jc w:val="both"/>
       </w:pPr>
       <w:r>
-        <w:t>Florence Nightingale fue una enfermera británica que cambió la manera en que se atendía a los pacientes durante el siglo XIX. Se hizo conocida principalmente por su trabajo en la Guerra de Crimea, donde dirigió a un grupo de enfermeras en hospitales militares que tenían muy malas condiciones de higiene. Elegimos a Nightingale porque no solo ayudó a los soldados heridos, sino que también logró cambiar prácticas que en ese tiempo se consideraban normales.</w:t>
+        <w:t>Elegimos a Florence Nightingale porque su historia nos pareció un buen ejemplo de cómo una persona puede cambiar una realidad muy difícil. Fue una enfermera británica del siglo XIX y se hizo conocida por su trabajo durante la Guerra de Crimea. En los hospitales militares había suciedad, poco orden y muchos soldados enfermos. Ella estuvo a cargo de un grupo de enfermeras y tuvo que trabajar en esas malas condiciones.</w:t>
       </w:r>
     </w:p>
     <w:p>
@@ -145,7 +145,7 @@
         <w:jc w:val="both"/>
       </w:pPr>
       <w:r>
-        <w:t>Su forma de dirigir se relaciona con el liderazgo transformacional. Según el apunte de la semana, este liderazgo busca inspirar a otras personas, promover ideas nuevas y producir un cambio profundo. Nightingale observó que muchos soldados morían por infecciones y por la falta de limpieza, más que por sus heridas. Por eso organizó la limpieza de las salas, mejoró la ventilación y se preocupó por la alimentación y el orden del hospital. Además, utilizó datos y gráficos para demostrar a las autoridades la importancia de aplicar medidas sanitarias.</w:t>
+        <w:t>Nosotros relacionamos su forma de dirigir con el liderazgo transformacional. En el apunte se explica que este tipo de líder inspira a otras personas, propone ideas nuevas y busca cambios que sean importantes. Nightingale se dio cuenta de que varios soldados no morían solamente por sus heridas, sino también por infecciones que podían evitarse. Por eso organizó la limpieza de las salas, mejoró la ventilación y se preocupó por la comida y el orden del hospital. Incluso usó datos y gráficos para mostrarles a las autoridades lo que estaba pasando.</w:t>
       </w:r>
     </w:p>
     <w:p>
@@ -154,7 +154,7 @@
         <w:jc w:val="both"/>
       </w:pPr>
       <w:r>
-        <w:t>En su caso se pueden reconocer características mencionadas por Bass (1985), como la motivación inspiradora y la estimulación intelectual. Nightingale motivó a otras enfermeras y las llevó a cuestionar procedimientos que no estaban funcionando. También tuvo una visión de largo plazo, porque después de la guerra impulsó la formación profesional de las enfermeras. El contexto fue importante: en medio de una guerra había poco tiempo y muchos recursos eran escasos. A pesar de eso, pudo organizar al equipo y demostrar que era posible trabajar de otra manera. Por estas razones, creemos que su liderazgo fue transformacional, ya que su influencia produjo mejoras que continuaron después de la crisis y ayudaron a que la enfermería fuera reconocida como una profesión fundamental.</w:t>
+        <w:t>También motivó a las demás enfermeras para que cambiaran procedimientos que no daban buenos resultados. Esto se relaciona con lo planteado por Bass (1985), especialmente con la motivación y la estimulación de nuevas ideas. Después de la guerra siguió trabajando para que las enfermeras tuvieran una mejor preparación. Creemos que lo más importante fue que no se conformó con atender el problema del momento, sino que trató de mejorar todo el sistema. Por eso la consideramos una líder transformacional. Su trabajo dejó cambios que siguieron existiendo muchos años después y ayudó a que la enfermería fuera tomada más en serio como profesión.</w:t>
       </w:r>
     </w:p>
     <w:p>
@@ -176,7 +176,7 @@
         <w:jc w:val="both"/>
       </w:pPr>
       <w:r>
-        <w:t>Nelson Mandela fue un líder político sudafricano que luchó contra el apartheid, un sistema de discriminación racial que limitaba los derechos de la población negra. Estuvo encarcelado durante veintisiete años y, después de recuperar su libertad, participó en las negociaciones que permitieron realizar elecciones democráticas. En 1994 llegó a ser el primer presidente negro de Sudáfrica.</w:t>
+        <w:t>Como segundo personaje elegimos a Nelson Mandela. Fue un líder político sudafricano que luchó contra el apartheid, que era un sistema de discriminación racial que quitaba derechos a la población negra. Estuvo preso durante veintisiete años. Cuando recuperó su libertad participó en las negociaciones que hicieron posibles las elecciones democráticas y en 1994 se convirtió en el primer presidente negro de Sudáfrica.</w:t>
       </w:r>
     </w:p>
     <w:p>
@@ -185,7 +185,7 @@
         <w:jc w:val="both"/>
       </w:pPr>
       <w:r>
-        <w:t>Consideramos que Mandela representa el liderazgo democrático. El apunte explica que este estilo promueve la participación, el diálogo y la inclusión de las personas en la toma de decisiones. El líder mantiene la responsabilidad final, pero escucha diferentes opiniones y trata de construir acuerdos. Mandela demostró estas características cuando decidió negociar con el gobierno y con grupos que habían sido sus adversarios. En vez de buscar venganza, promovió la reconciliación y apoyó la formación de un gobierno de unidad nacional.</w:t>
+        <w:t>Para nosotros, Mandela representa el liderazgo democrático. El apunte señala que este liderazgo se basa en la participación, el diálogo y la inclusión de las personas al momento de decidir. El líder sigue teniendo una responsabilidad, pero escucha opiniones y trata de llegar a acuerdos. Mandela hizo esto al conversar con el gobierno y con personas que antes habían sido sus adversarios. Algo que nos llamó la atención es que no buscó vengarse después de salir de la cárcel. En cambio, habló de reconciliación y apoyó un gobierno en el que participaron distintos grupos.</w:t>
       </w:r>
     </w:p>
     <w:p>
@@ -203,7 +203,7 @@
         <w:jc w:val="both"/>
       </w:pPr>
       <w:r>
-        <w:t>Su liderazgo generó confianza y ayudó a que muchas personas se sintieran parte de la construcción de una nueva sociedad. También demuestra que ser democrático no significa evitar decisiones difíciles, sino considerar a los demás y buscar resultados que tengan legitimidad. Por el contexto histórico que enfrentó y por su capacidad para escuchar, negociar e incluir, creemos que este tipo de liderazgo es el que mejor representa sus acciones.</w:t>
+        <w:t>Pensamos que su forma de liderar ayudó a generar confianza y a que muchas personas se sintieran parte del cambio del país. Su caso también muestra que un líder democrático igual debe tomar decisiones difíciles. La diferencia es que considera a los demás y no decide todo por su cuenta. Por el momento histórico que vivió y por su capacidad para escuchar, negociar e incluir a diferentes grupos, creemos que este estilo es el que mejor representa a Mandela.</w:t>
       </w:r>
     </w:p>
     <w:p>
@@ -225,7 +225,7 @@
         <w:jc w:val="both"/>
       </w:pPr>
       <w:r>
-        <w:t>Ernest Shackleton fue un explorador británico-irlandés que dirigió la Expedición Imperial Transantártica de 1914. Su objetivo era atravesar la Antártida, pero el barco Endurance quedó atrapado en el hielo y finalmente fue destruido. Desde ese momento, el objetivo principal dejó de ser completar la expedición y pasó a ser mantener con vida a todos los integrantes del grupo.</w:t>
+        <w:t>El tercer personaje es Ernest Shackleton, un explorador británico-irlandés que dirigió una expedición a la Antártida en 1914. Al principio su meta era atravesar el continente, pero su barco, el Endurance, quedó atrapado y fue destruido por el hielo. En ese momento el plan tuvo que cambiar por completo. Ya no importaba terminar el viaje, sino lograr que todos regresaran vivos.</w:t>
       </w:r>
     </w:p>
     <w:p>
@@ -234,7 +234,7 @@
         <w:jc w:val="both"/>
       </w:pPr>
       <w:r>
-        <w:t>Su caso se relaciona con el liderazgo situacional, porque tuvo que cambiar su manera de dirigir de acuerdo con cada problema. De acuerdo con Hersey y Blanchard (1982), no existe un único estilo que funcione en todas las situaciones. El líder puede dar instrucciones, apoyar, persuadir o delegar según las capacidades del equipo y las circunstancias. Shackleton fue muy directivo cuando ordenó abandonar el barco y controlar los alimentos. En esos momentos necesitaba decidir con rapidez, ya que una discusión larga podía aumentar el peligro.</w:t>
+        <w:t>Escogimos este caso para representar el liderazgo situacional, porque Shackleton tuvo que cambiar su forma de dirigir varias veces. Hersey y Blanchard (1982) explican que un mismo estilo no sirve para todas las situaciones. A veces el líder debe dar instrucciones claras y otras veces debe apoyar o delegar. Por ejemplo, Shackleton actuó de manera muy directa cuando ordenó abandonar el barco y controlar los alimentos. Era una emergencia y demorarse demasiado en decidir podía ponerlos en mayor peligro.</w:t>
       </w:r>
     </w:p>
     <w:p>
@@ -252,7 +252,7 @@
         <w:jc w:val="both"/>
       </w:pPr>
       <w:r>
-        <w:t>La mayor prueba de su capacidad de adaptación fue renunciar a la meta original. Continuar la expedición habría puesto en riesgo a todos, por lo que cambió el plan y concentró sus esfuerzos en el rescate. Finalmente, todos los miembros de la tripulación sobrevivieron. Pensamos que Shackleton es un buen ejemplo de liderazgo situacional porque combinó dirección, apoyo y delegación en distintas etapas. Su experiencia demuestra que un líder debe observar el contexto y cambiar su estrategia cuando las condiciones lo requieren.</w:t>
+        <w:t>Lo que más demuestra su capacidad de adaptación fue que aceptó abandonar su objetivo inicial. Seguir con la expedición habría sido demasiado arriesgado, así que se concentró en el rescate. Finalmente, todos sobrevivieron. Creemos que Shackleton representa bien el liderazgo situacional porque no reaccionó siempre de la misma manera: fue firme cuando era necesario, apoyó al grupo y también entregó responsabilidades. Su historia deja claro que cambiar un plan no siempre significa fracasar, especialmente cuando la situación y el bienestar del equipo exigen otra decisión.</w:t>
       </w:r>
     </w:p>
     <w:p>
@@ -274,7 +274,7 @@
         <w:jc w:val="both"/>
       </w:pPr>
       <w:r>
-        <w:t>Los tres personajes muestran que no hay una sola manera de liderar. Florence Nightingale produjo cambios mediante nuevas ideas y una visión de futuro; Nelson Mandela usó el diálogo para unir a una sociedad dividida; y Ernest Shackleton fue modificando sus decisiones frente a una emergencia. Aunque actuaron en áreas y contextos diferentes, los tres fueron capaces de orientar a otras personas hacia un objetivo común. Esto confirma lo señalado en el apunte: la efectividad del liderazgo depende tanto de las características del líder como de las necesidades del equipo y de la situación.</w:t>
+        <w:t>Después de revisar estos tres casos, entendimos que no existe una sola manera correcta de liderar. Florence Nightingale cambió la enfermería con nuevas ideas, Nelson Mandela prefirió el diálogo para unir a un país dividido y Ernest Shackleton fue ajustando sus decisiones durante una emergencia. Sus situaciones eran muy distintas, pero los tres lograron guiar a otras personas hacia una meta. En nuestra opinión, un buen líder no solo necesita tener autoridad. También debe saber escuchar, organizar al equipo y darse cuenta de cuándo es necesario cambiar su forma de actuar.</w:t>
       </w:r>
     </w:p>
     <w:p>

</xml_diff>